<commit_message>
subi a documentação atualizada hoje
</commit_message>
<xml_diff>
--- a/documentação oficial/Documentação atualizada 17-06-26.docx
+++ b/documentação oficial/Documentação atualizada 17-06-26.docx
@@ -6033,10 +6033,28 @@
         <w:jc w:val="both"/>
         <w:rPr>
           <w:rFonts w:ascii="Arial" w:eastAsia="Arial" w:hAnsi="Arial" w:cs="Arial"/>
-          <w:b/>
-          <w:bCs/>
-        </w:rPr>
-      </w:pPr>
+        </w:rPr>
+      </w:pPr>
+      <w:r>
+        <w:rPr>
+          <w:rFonts w:ascii="Arial" w:eastAsia="Arial" w:hAnsi="Arial" w:cs="Arial"/>
+        </w:rPr>
+        <w:t xml:space="preserve">Pesquisas feitas no google de acordo com as referências e auxilio do </w:t>
+      </w:r>
+      <w:proofErr w:type="spellStart"/>
+      <w:r>
+        <w:rPr>
+          <w:rFonts w:ascii="Arial" w:eastAsia="Arial" w:hAnsi="Arial" w:cs="Arial"/>
+        </w:rPr>
+        <w:t>Grok</w:t>
+      </w:r>
+      <w:proofErr w:type="spellEnd"/>
+      <w:r>
+        <w:rPr>
+          <w:rFonts w:ascii="Arial" w:eastAsia="Arial" w:hAnsi="Arial" w:cs="Arial"/>
+        </w:rPr>
+        <w:t xml:space="preserve"> e ChatGPT para formatação e melhoria de texto.</w:t>
+      </w:r>
     </w:p>
     <w:p>
       <w:pPr>
@@ -6044,8 +6062,6 @@
         <w:jc w:val="both"/>
         <w:rPr>
           <w:rFonts w:ascii="Arial" w:eastAsia="Arial" w:hAnsi="Arial" w:cs="Arial"/>
-          <w:b/>
-          <w:bCs/>
         </w:rPr>
       </w:pPr>
     </w:p>
@@ -6055,8 +6071,6 @@
         <w:jc w:val="both"/>
         <w:rPr>
           <w:rFonts w:ascii="Arial" w:eastAsia="Arial" w:hAnsi="Arial" w:cs="Arial"/>
-          <w:b/>
-          <w:bCs/>
         </w:rPr>
       </w:pPr>
     </w:p>
@@ -6066,8 +6080,6 @@
         <w:jc w:val="both"/>
         <w:rPr>
           <w:rFonts w:ascii="Arial" w:eastAsia="Arial" w:hAnsi="Arial" w:cs="Arial"/>
-          <w:b/>
-          <w:bCs/>
         </w:rPr>
       </w:pPr>
     </w:p>
@@ -6077,8 +6089,6 @@
         <w:jc w:val="both"/>
         <w:rPr>
           <w:rFonts w:ascii="Arial" w:eastAsia="Arial" w:hAnsi="Arial" w:cs="Arial"/>
-          <w:b/>
-          <w:bCs/>
         </w:rPr>
       </w:pPr>
     </w:p>
@@ -6088,8 +6098,6 @@
         <w:jc w:val="both"/>
         <w:rPr>
           <w:rFonts w:ascii="Arial" w:eastAsia="Arial" w:hAnsi="Arial" w:cs="Arial"/>
-          <w:b/>
-          <w:bCs/>
         </w:rPr>
       </w:pPr>
     </w:p>
@@ -6099,19 +6107,6 @@
         <w:jc w:val="both"/>
         <w:rPr>
           <w:rFonts w:ascii="Arial" w:eastAsia="Arial" w:hAnsi="Arial" w:cs="Arial"/>
-          <w:b/>
-          <w:bCs/>
-        </w:rPr>
-      </w:pPr>
-    </w:p>
-    <w:p>
-      <w:pPr>
-        <w:spacing w:after="120" w:line="360" w:lineRule="auto"/>
-        <w:jc w:val="both"/>
-        <w:rPr>
-          <w:rFonts w:ascii="Arial" w:eastAsia="Arial" w:hAnsi="Arial" w:cs="Arial"/>
-          <w:b/>
-          <w:bCs/>
         </w:rPr>
       </w:pPr>
     </w:p>
@@ -6932,7 +6927,7 @@
         </w:rPr>
         <w:lastRenderedPageBreak/>
         <w:drawing>
-          <wp:inline distT="0" distB="0" distL="0" distR="0" wp14:anchorId="51A4631C" wp14:editId="20106BC0">
+          <wp:inline distT="0" distB="0" distL="0" distR="0" wp14:anchorId="51A4631C" wp14:editId="4293E4D8">
             <wp:extent cx="3552825" cy="5762625"/>
             <wp:effectExtent l="0" t="0" r="0" b="0"/>
             <wp:docPr id="516443911" name="drawing"/>

</xml_diff>